<commit_message>
update publication venue doc
</commit_message>
<xml_diff>
--- a/docs/paper/publication_venue_recommendations.docx
+++ b/docs/paper/publication_venue_recommendations.docx
@@ -410,13 +410,7 @@
         <w:spacing w:before="200" w:after="80"/>
       </w:pPr>
       <w:r>
-        <w:rPr>
-          <w:rFonts w:ascii="Carlito" w:hAnsi="Carlito" w:eastAsia="Carlito"/>
-          <w:b/>
-          <w:color w:val="17365D"/>
-          <w:sz w:val="32"/>
-        </w:rPr>
-        <w:t>Recommended journals</w:t>
+        <w:t>Recommended journals: timing, costs, and priority ranking</w:t>
       </w:r>
     </w:p>
     <w:p>
@@ -446,26 +440,2052 @@
     <w:p>
       <w:pPr>
         <w:pStyle w:val="Heading2"/>
+      </w:pPr>
+      <w:r>
+        <w:t>Decision time and publication cost snapshot</w:t>
+      </w:r>
+    </w:p>
+    <w:p>
+      <w:r>
+        <w:rPr>
+          <w:b/>
+        </w:rPr>
+        <w:t xml:space="preserve">Checked 5 September 2026. </w:t>
+      </w:r>
+      <w:r>
+        <w:t>The table covers the ten recommended journals and uses each publisher’s current first-decision statistic or stated target and the likely standard research-article charge. Click an underlined value to open its publisher source.</w:t>
+      </w:r>
+    </w:p>
+    <w:tbl>
+      <w:tblPr>
+        <w:tblStyle w:val="LightShading-Accent1"/>
+        <w:tblW w:type="dxa" w:w="9994"/>
+        <w:jc w:val="center"/>
+        <w:tblLayout w:type="fixed"/>
+        <w:tblLook w:firstColumn="1" w:firstRow="1" w:lastColumn="0" w:lastRow="0" w:noHBand="0" w:noVBand="1" w:val="04A0"/>
+        <w:tblBorders>
+          <w:top w:val="single" w:sz="4" w:space="0" w:color="C9DADD"/>
+          <w:left w:val="single" w:sz="4" w:space="0" w:color="C9DADD"/>
+          <w:bottom w:val="single" w:sz="4" w:space="0" w:color="C9DADD"/>
+          <w:right w:val="single" w:sz="4" w:space="0" w:color="C9DADD"/>
+          <w:insideH w:val="single" w:sz="4" w:space="0" w:color="C9DADD"/>
+          <w:insideV w:val="single" w:sz="4" w:space="0" w:color="C9DADD"/>
+        </w:tblBorders>
+      </w:tblPr>
+      <w:tblGrid>
+        <w:gridCol w:w="2477"/>
+        <w:gridCol w:w="2952"/>
+        <w:gridCol w:w="4565"/>
+      </w:tblGrid>
+      <w:tr>
+        <w:trPr>
+          <w:tblHeader w:val="true"/>
+        </w:trPr>
+        <w:tc>
+          <w:tcPr>
+            <w:tcW w:type="dxa" w:w="2477"/>
+            <w:vAlign w:val="center"/>
+            <w:tcMar>
+              <w:top w:w="65" w:type="dxa"/>
+              <w:start w:w="80" w:type="dxa"/>
+              <w:bottom w:w="65" w:type="dxa"/>
+              <w:end w:w="80" w:type="dxa"/>
+            </w:tcMar>
+            <w:shd w:val="clear" w:color="auto" w:fill="1F6D7A"/>
+          </w:tcPr>
+          <w:p>
+            <w:pPr>
+              <w:spacing w:before="0" w:after="0" w:line="240" w:lineRule="auto"/>
+            </w:pPr>
+            <w:r>
+              <w:rPr>
+                <w:color w:val="FFFFFF"/>
+              </w:rPr>
+            </w:r>
+            <w:r>
+              <w:rPr>
+                <w:rFonts w:ascii="Carlito" w:hAnsi="Carlito"/>
+                <w:b/>
+                <w:color w:val="FFFFFF"/>
+                <w:sz w:val="18"/>
+              </w:rPr>
+              <w:t>Journal</w:t>
+            </w:r>
+          </w:p>
+        </w:tc>
+        <w:tc>
+          <w:tcPr>
+            <w:tcW w:type="dxa" w:w="2952"/>
+            <w:vAlign w:val="center"/>
+            <w:tcMar>
+              <w:top w:w="65" w:type="dxa"/>
+              <w:start w:w="80" w:type="dxa"/>
+              <w:bottom w:w="65" w:type="dxa"/>
+              <w:end w:w="80" w:type="dxa"/>
+            </w:tcMar>
+            <w:shd w:val="clear" w:color="auto" w:fill="1F6D7A"/>
+          </w:tcPr>
+          <w:p>
+            <w:pPr>
+              <w:spacing w:before="0" w:after="0" w:line="240" w:lineRule="auto"/>
+            </w:pPr>
+            <w:r>
+              <w:rPr>
+                <w:color w:val="FFFFFF"/>
+              </w:rPr>
+            </w:r>
+            <w:r>
+              <w:rPr>
+                <w:rFonts w:ascii="Carlito" w:hAnsi="Carlito"/>
+                <w:b/>
+                <w:color w:val="FFFFFF"/>
+                <w:sz w:val="18"/>
+              </w:rPr>
+              <w:t>Submission to first decision</w:t>
+            </w:r>
+          </w:p>
+        </w:tc>
+        <w:tc>
+          <w:tcPr>
+            <w:tcW w:type="dxa" w:w="4565"/>
+            <w:vAlign w:val="center"/>
+            <w:tcMar>
+              <w:top w:w="65" w:type="dxa"/>
+              <w:start w:w="80" w:type="dxa"/>
+              <w:bottom w:w="65" w:type="dxa"/>
+              <w:end w:w="80" w:type="dxa"/>
+            </w:tcMar>
+            <w:shd w:val="clear" w:color="auto" w:fill="1F6D7A"/>
+          </w:tcPr>
+          <w:p>
+            <w:pPr>
+              <w:spacing w:before="0" w:after="0" w:line="240" w:lineRule="auto"/>
+            </w:pPr>
+            <w:r>
+              <w:rPr>
+                <w:color w:val="FFFFFF"/>
+              </w:rPr>
+            </w:r>
+            <w:r>
+              <w:rPr>
+                <w:rFonts w:ascii="Carlito" w:hAnsi="Carlito"/>
+                <w:b/>
+                <w:color w:val="FFFFFF"/>
+                <w:sz w:val="18"/>
+              </w:rPr>
+              <w:t>Published charge before coverage</w:t>
+            </w:r>
+          </w:p>
+        </w:tc>
+      </w:tr>
+      <w:tr>
+        <w:tc>
+          <w:tcPr>
+            <w:tcW w:type="dxa" w:w="2477"/>
+            <w:vAlign w:val="center"/>
+            <w:tcMar>
+              <w:top w:w="65" w:type="dxa"/>
+              <w:start w:w="80" w:type="dxa"/>
+              <w:bottom w:w="65" w:type="dxa"/>
+              <w:end w:w="80" w:type="dxa"/>
+            </w:tcMar>
+            <w:shd w:val="clear" w:color="auto" w:fill="FFFFFF"/>
+          </w:tcPr>
+          <w:p>
+            <w:pPr>
+              <w:spacing w:before="0" w:after="0" w:line="240" w:lineRule="auto"/>
+            </w:pPr>
+            <w:r>
+              <w:rPr>
+                <w:rFonts w:ascii="Carlito" w:hAnsi="Carlito"/>
+                <w:b/>
+                <w:sz w:val="18"/>
+              </w:rPr>
+              <w:t>Plant Direct</w:t>
+            </w:r>
+          </w:p>
+        </w:tc>
+        <w:tc>
+          <w:tcPr>
+            <w:tcW w:type="dxa" w:w="2952"/>
+            <w:vAlign w:val="center"/>
+            <w:tcMar>
+              <w:top w:w="65" w:type="dxa"/>
+              <w:start w:w="80" w:type="dxa"/>
+              <w:bottom w:w="65" w:type="dxa"/>
+              <w:end w:w="80" w:type="dxa"/>
+            </w:tcMar>
+            <w:shd w:val="clear" w:color="auto" w:fill="FFFFFF"/>
+          </w:tcPr>
+          <w:p>
+            <w:pPr>
+              <w:spacing w:before="0" w:after="0" w:line="240" w:lineRule="auto"/>
+            </w:pPr>
+            <w:r/>
+            <w:hyperlink r:id="rId31">
+              <w:r>
+                <w:rPr>
+                  <w:rFonts w:ascii="Carlito" w:hAnsi="Carlito"/>
+                  <w:color w:val="0563C1"/>
+                  <w:u w:val="single"/>
+                  <w:sz w:val="18"/>
+                  <w:szCs w:val="18"/>
+                </w:rPr>
+                <w:t>31 days (median)</w:t>
+              </w:r>
+            </w:hyperlink>
+          </w:p>
+        </w:tc>
+        <w:tc>
+          <w:tcPr>
+            <w:tcW w:type="dxa" w:w="4565"/>
+            <w:vAlign w:val="center"/>
+            <w:tcMar>
+              <w:top w:w="65" w:type="dxa"/>
+              <w:start w:w="80" w:type="dxa"/>
+              <w:bottom w:w="65" w:type="dxa"/>
+              <w:end w:w="80" w:type="dxa"/>
+            </w:tcMar>
+            <w:shd w:val="clear" w:color="auto" w:fill="FFFFFF"/>
+          </w:tcPr>
+          <w:p>
+            <w:pPr>
+              <w:spacing w:before="0" w:after="0" w:line="240" w:lineRule="auto"/>
+            </w:pPr>
+            <w:r/>
+            <w:hyperlink r:id="rId32">
+              <w:r>
+                <w:rPr>
+                  <w:rFonts w:ascii="Carlito" w:hAnsi="Carlito"/>
+                  <w:color w:val="0563C1"/>
+                  <w:u w:val="single"/>
+                  <w:sz w:val="18"/>
+                  <w:szCs w:val="18"/>
+                </w:rPr>
+                <w:t>US$3,120; society members receive 20% off (US$2,496)</w:t>
+              </w:r>
+            </w:hyperlink>
+          </w:p>
+        </w:tc>
+      </w:tr>
+      <w:tr>
+        <w:tc>
+          <w:tcPr>
+            <w:tcW w:type="dxa" w:w="2477"/>
+            <w:vAlign w:val="center"/>
+            <w:tcMar>
+              <w:top w:w="65" w:type="dxa"/>
+              <w:start w:w="80" w:type="dxa"/>
+              <w:bottom w:w="65" w:type="dxa"/>
+              <w:end w:w="80" w:type="dxa"/>
+            </w:tcMar>
+            <w:shd w:val="clear" w:color="auto" w:fill="EEF4F5"/>
+          </w:tcPr>
+          <w:p>
+            <w:pPr>
+              <w:spacing w:before="0" w:after="0" w:line="240" w:lineRule="auto"/>
+            </w:pPr>
+            <w:r>
+              <w:rPr>
+                <w:rFonts w:ascii="Carlito" w:hAnsi="Carlito"/>
+                <w:b/>
+                <w:sz w:val="18"/>
+              </w:rPr>
+              <w:t>BMC Genomics</w:t>
+            </w:r>
+          </w:p>
+        </w:tc>
+        <w:tc>
+          <w:tcPr>
+            <w:tcW w:type="dxa" w:w="2952"/>
+            <w:vAlign w:val="center"/>
+            <w:tcMar>
+              <w:top w:w="65" w:type="dxa"/>
+              <w:start w:w="80" w:type="dxa"/>
+              <w:bottom w:w="65" w:type="dxa"/>
+              <w:end w:w="80" w:type="dxa"/>
+            </w:tcMar>
+            <w:shd w:val="clear" w:color="auto" w:fill="EEF4F5"/>
+          </w:tcPr>
+          <w:p>
+            <w:pPr>
+              <w:spacing w:before="0" w:after="0" w:line="240" w:lineRule="auto"/>
+            </w:pPr>
+            <w:r/>
+            <w:hyperlink r:id="rId33">
+              <w:r>
+                <w:rPr>
+                  <w:rFonts w:ascii="Carlito" w:hAnsi="Carlito"/>
+                  <w:color w:val="0563C1"/>
+                  <w:u w:val="single"/>
+                  <w:sz w:val="18"/>
+                  <w:szCs w:val="18"/>
+                </w:rPr>
+                <w:t>4 days (median; includes rapid editorial outcomes)</w:t>
+              </w:r>
+            </w:hyperlink>
+          </w:p>
+        </w:tc>
+        <w:tc>
+          <w:tcPr>
+            <w:tcW w:type="dxa" w:w="4565"/>
+            <w:vAlign w:val="center"/>
+            <w:tcMar>
+              <w:top w:w="65" w:type="dxa"/>
+              <w:start w:w="80" w:type="dxa"/>
+              <w:bottom w:w="65" w:type="dxa"/>
+              <w:end w:w="80" w:type="dxa"/>
+            </w:tcMar>
+            <w:shd w:val="clear" w:color="auto" w:fill="EEF4F5"/>
+          </w:tcPr>
+          <w:p>
+            <w:pPr>
+              <w:spacing w:before="0" w:after="0" w:line="240" w:lineRule="auto"/>
+            </w:pPr>
+            <w:r/>
+            <w:hyperlink r:id="rId34">
+              <w:r>
+                <w:rPr>
+                  <w:rFonts w:ascii="Carlito" w:hAnsi="Carlito"/>
+                  <w:color w:val="0563C1"/>
+                  <w:u w:val="single"/>
+                  <w:sz w:val="18"/>
+                  <w:szCs w:val="18"/>
+                </w:rPr>
+                <w:t>US$3,190 / £2,390 / €2,790</w:t>
+              </w:r>
+            </w:hyperlink>
+          </w:p>
+        </w:tc>
+      </w:tr>
+      <w:tr>
+        <w:tc>
+          <w:tcPr>
+            <w:tcW w:type="dxa" w:w="2477"/>
+            <w:vAlign w:val="center"/>
+            <w:tcMar>
+              <w:top w:w="65" w:type="dxa"/>
+              <w:start w:w="80" w:type="dxa"/>
+              <w:bottom w:w="65" w:type="dxa"/>
+              <w:end w:w="80" w:type="dxa"/>
+            </w:tcMar>
+            <w:shd w:val="clear" w:color="auto" w:fill="FFFFFF"/>
+          </w:tcPr>
+          <w:p>
+            <w:pPr>
+              <w:spacing w:before="0" w:after="0" w:line="240" w:lineRule="auto"/>
+            </w:pPr>
+            <w:r>
+              <w:rPr>
+                <w:rFonts w:ascii="Carlito" w:hAnsi="Carlito"/>
+                <w:b/>
+                <w:sz w:val="18"/>
+              </w:rPr>
+              <w:t>PhytoFrontiers</w:t>
+            </w:r>
+          </w:p>
+        </w:tc>
+        <w:tc>
+          <w:tcPr>
+            <w:tcW w:type="dxa" w:w="2952"/>
+            <w:vAlign w:val="center"/>
+            <w:tcMar>
+              <w:top w:w="65" w:type="dxa"/>
+              <w:start w:w="80" w:type="dxa"/>
+              <w:bottom w:w="65" w:type="dxa"/>
+              <w:end w:w="80" w:type="dxa"/>
+            </w:tcMar>
+            <w:shd w:val="clear" w:color="auto" w:fill="FFFFFF"/>
+          </w:tcPr>
+          <w:p>
+            <w:pPr>
+              <w:spacing w:before="0" w:after="0" w:line="240" w:lineRule="auto"/>
+            </w:pPr>
+            <w:r/>
+            <w:hyperlink r:id="rId35">
+              <w:r>
+                <w:rPr>
+                  <w:rFonts w:ascii="Carlito" w:hAnsi="Carlito"/>
+                  <w:color w:val="0563C1"/>
+                  <w:u w:val="single"/>
+                  <w:sz w:val="18"/>
+                  <w:szCs w:val="18"/>
+                </w:rPr>
+                <w:t>Not reported for this journal (APS metrics table is blank)</w:t>
+              </w:r>
+            </w:hyperlink>
+          </w:p>
+        </w:tc>
+        <w:tc>
+          <w:tcPr>
+            <w:tcW w:type="dxa" w:w="4565"/>
+            <w:vAlign w:val="center"/>
+            <w:tcMar>
+              <w:top w:w="65" w:type="dxa"/>
+              <w:start w:w="80" w:type="dxa"/>
+              <w:bottom w:w="65" w:type="dxa"/>
+              <w:end w:w="80" w:type="dxa"/>
+            </w:tcMar>
+            <w:shd w:val="clear" w:color="auto" w:fill="FFFFFF"/>
+          </w:tcPr>
+          <w:p>
+            <w:pPr>
+              <w:spacing w:before="0" w:after="0" w:line="240" w:lineRule="auto"/>
+            </w:pPr>
+            <w:r/>
+            <w:hyperlink r:id="rId36">
+              <w:r>
+                <w:rPr>
+                  <w:rFonts w:ascii="Carlito" w:hAnsi="Carlito"/>
+                  <w:color w:val="0563C1"/>
+                  <w:u w:val="single"/>
+                  <w:sz w:val="18"/>
+                  <w:szCs w:val="18"/>
+                </w:rPr>
+                <w:t>First 12 published pages: US$2,550 member / US$2,678 nonmember; then US$144 / US$215 per page; US$80 per supplementary file</w:t>
+              </w:r>
+            </w:hyperlink>
+          </w:p>
+        </w:tc>
+      </w:tr>
+      <w:tr>
+        <w:tc>
+          <w:tcPr>
+            <w:tcW w:type="dxa" w:w="2477"/>
+            <w:vAlign w:val="center"/>
+            <w:tcMar>
+              <w:top w:w="65" w:type="dxa"/>
+              <w:start w:w="80" w:type="dxa"/>
+              <w:bottom w:w="65" w:type="dxa"/>
+              <w:end w:w="80" w:type="dxa"/>
+            </w:tcMar>
+            <w:shd w:val="clear" w:color="auto" w:fill="EEF4F5"/>
+          </w:tcPr>
+          <w:p>
+            <w:pPr>
+              <w:spacing w:before="0" w:after="0" w:line="240" w:lineRule="auto"/>
+            </w:pPr>
+            <w:r>
+              <w:rPr>
+                <w:rFonts w:ascii="Carlito" w:hAnsi="Carlito"/>
+                <w:b/>
+                <w:sz w:val="18"/>
+              </w:rPr>
+              <w:t>BMC Plant Biology</w:t>
+            </w:r>
+          </w:p>
+        </w:tc>
+        <w:tc>
+          <w:tcPr>
+            <w:tcW w:type="dxa" w:w="2952"/>
+            <w:vAlign w:val="center"/>
+            <w:tcMar>
+              <w:top w:w="65" w:type="dxa"/>
+              <w:start w:w="80" w:type="dxa"/>
+              <w:bottom w:w="65" w:type="dxa"/>
+              <w:end w:w="80" w:type="dxa"/>
+            </w:tcMar>
+            <w:shd w:val="clear" w:color="auto" w:fill="EEF4F5"/>
+          </w:tcPr>
+          <w:p>
+            <w:pPr>
+              <w:spacing w:before="0" w:after="0" w:line="240" w:lineRule="auto"/>
+            </w:pPr>
+            <w:r/>
+            <w:hyperlink r:id="rId37">
+              <w:r>
+                <w:rPr>
+                  <w:rFonts w:ascii="Carlito" w:hAnsi="Carlito"/>
+                  <w:color w:val="0563C1"/>
+                  <w:u w:val="single"/>
+                  <w:sz w:val="18"/>
+                  <w:szCs w:val="18"/>
+                </w:rPr>
+                <w:t>11 days (median; includes rapid editorial outcomes)</w:t>
+              </w:r>
+            </w:hyperlink>
+          </w:p>
+        </w:tc>
+        <w:tc>
+          <w:tcPr>
+            <w:tcW w:type="dxa" w:w="4565"/>
+            <w:vAlign w:val="center"/>
+            <w:tcMar>
+              <w:top w:w="65" w:type="dxa"/>
+              <w:start w:w="80" w:type="dxa"/>
+              <w:bottom w:w="65" w:type="dxa"/>
+              <w:end w:w="80" w:type="dxa"/>
+            </w:tcMar>
+            <w:shd w:val="clear" w:color="auto" w:fill="EEF4F5"/>
+          </w:tcPr>
+          <w:p>
+            <w:pPr>
+              <w:spacing w:before="0" w:after="0" w:line="240" w:lineRule="auto"/>
+            </w:pPr>
+            <w:r/>
+            <w:hyperlink r:id="rId38">
+              <w:r>
+                <w:rPr>
+                  <w:rFonts w:ascii="Carlito" w:hAnsi="Carlito"/>
+                  <w:color w:val="0563C1"/>
+                  <w:u w:val="single"/>
+                  <w:sz w:val="18"/>
+                  <w:szCs w:val="18"/>
+                </w:rPr>
+                <w:t>US$3,190 / £2,490 / €2,790</w:t>
+              </w:r>
+            </w:hyperlink>
+          </w:p>
+        </w:tc>
+      </w:tr>
+      <w:tr>
+        <w:tc>
+          <w:tcPr>
+            <w:tcW w:type="dxa" w:w="2477"/>
+            <w:vAlign w:val="center"/>
+            <w:tcMar>
+              <w:top w:w="65" w:type="dxa"/>
+              <w:start w:w="80" w:type="dxa"/>
+              <w:bottom w:w="65" w:type="dxa"/>
+              <w:end w:w="80" w:type="dxa"/>
+            </w:tcMar>
+            <w:shd w:val="clear" w:color="auto" w:fill="FFFFFF"/>
+          </w:tcPr>
+          <w:p>
+            <w:pPr>
+              <w:spacing w:before="0" w:after="0" w:line="240" w:lineRule="auto"/>
+            </w:pPr>
+            <w:r>
+              <w:rPr>
+                <w:rFonts w:ascii="Carlito" w:hAnsi="Carlito"/>
+                <w:b/>
+                <w:sz w:val="18"/>
+              </w:rPr>
+              <w:t>Royal Society Open Science</w:t>
+            </w:r>
+          </w:p>
+        </w:tc>
+        <w:tc>
+          <w:tcPr>
+            <w:tcW w:type="dxa" w:w="2952"/>
+            <w:vAlign w:val="center"/>
+            <w:tcMar>
+              <w:top w:w="65" w:type="dxa"/>
+              <w:start w:w="80" w:type="dxa"/>
+              <w:bottom w:w="65" w:type="dxa"/>
+              <w:end w:w="80" w:type="dxa"/>
+            </w:tcMar>
+            <w:shd w:val="clear" w:color="auto" w:fill="FFFFFF"/>
+          </w:tcPr>
+          <w:p>
+            <w:pPr>
+              <w:spacing w:before="0" w:after="0" w:line="240" w:lineRule="auto"/>
+            </w:pPr>
+            <w:r/>
+            <w:hyperlink r:id="rId39">
+              <w:r>
+                <w:rPr>
+                  <w:rFonts w:ascii="Carlito" w:hAnsi="Carlito"/>
+                  <w:color w:val="0563C1"/>
+                  <w:u w:val="single"/>
+                  <w:sz w:val="18"/>
+                  <w:szCs w:val="18"/>
+                </w:rPr>
+                <w:t>19 days (median for 2025; includes editorial decisions)</w:t>
+              </w:r>
+            </w:hyperlink>
+          </w:p>
+        </w:tc>
+        <w:tc>
+          <w:tcPr>
+            <w:tcW w:type="dxa" w:w="4565"/>
+            <w:vAlign w:val="center"/>
+            <w:tcMar>
+              <w:top w:w="65" w:type="dxa"/>
+              <w:start w:w="80" w:type="dxa"/>
+              <w:bottom w:w="65" w:type="dxa"/>
+              <w:end w:w="80" w:type="dxa"/>
+            </w:tcMar>
+            <w:shd w:val="clear" w:color="auto" w:fill="FFFFFF"/>
+          </w:tcPr>
+          <w:p>
+            <w:pPr>
+              <w:spacing w:before="0" w:after="0" w:line="240" w:lineRule="auto"/>
+            </w:pPr>
+            <w:r/>
+            <w:hyperlink r:id="rId40">
+              <w:r>
+                <w:rPr>
+                  <w:rFonts w:ascii="Carlito" w:hAnsi="Carlito"/>
+                  <w:color w:val="0563C1"/>
+                  <w:u w:val="single"/>
+                  <w:sz w:val="18"/>
+                  <w:szCs w:val="18"/>
+                </w:rPr>
+                <w:t>US$1,960 / £1,400 / €1,680</w:t>
+              </w:r>
+            </w:hyperlink>
+          </w:p>
+        </w:tc>
+      </w:tr>
+      <w:tr>
+        <w:tc>
+          <w:tcPr>
+            <w:tcW w:type="dxa" w:w="2477"/>
+            <w:vAlign w:val="center"/>
+            <w:tcMar>
+              <w:top w:w="65" w:type="dxa"/>
+              <w:start w:w="80" w:type="dxa"/>
+              <w:bottom w:w="65" w:type="dxa"/>
+              <w:end w:w="80" w:type="dxa"/>
+            </w:tcMar>
+            <w:shd w:val="clear" w:color="auto" w:fill="EEF4F5"/>
+          </w:tcPr>
+          <w:p>
+            <w:pPr>
+              <w:spacing w:before="0" w:after="0" w:line="240" w:lineRule="auto"/>
+            </w:pPr>
+            <w:r>
+              <w:rPr>
+                <w:rFonts w:ascii="Carlito" w:hAnsi="Carlito"/>
+                <w:b/>
+                <w:sz w:val="18"/>
+              </w:rPr>
+              <w:t>PLOS ONE</w:t>
+            </w:r>
+          </w:p>
+        </w:tc>
+        <w:tc>
+          <w:tcPr>
+            <w:tcW w:type="dxa" w:w="2952"/>
+            <w:vAlign w:val="center"/>
+            <w:tcMar>
+              <w:top w:w="65" w:type="dxa"/>
+              <w:start w:w="80" w:type="dxa"/>
+              <w:bottom w:w="65" w:type="dxa"/>
+              <w:end w:w="80" w:type="dxa"/>
+            </w:tcMar>
+            <w:shd w:val="clear" w:color="auto" w:fill="EEF4F5"/>
+          </w:tcPr>
+          <w:p>
+            <w:pPr>
+              <w:spacing w:before="0" w:after="0" w:line="240" w:lineRule="auto"/>
+            </w:pPr>
+            <w:r/>
+            <w:hyperlink r:id="rId18">
+              <w:r>
+                <w:rPr>
+                  <w:rFonts w:ascii="Carlito" w:hAnsi="Carlito"/>
+                  <w:color w:val="0563C1"/>
+                  <w:u w:val="single"/>
+                  <w:sz w:val="18"/>
+                  <w:szCs w:val="18"/>
+                </w:rPr>
+                <w:t>45 days (median; latest journal table is Jan–Jun 2023)</w:t>
+              </w:r>
+            </w:hyperlink>
+          </w:p>
+        </w:tc>
+        <w:tc>
+          <w:tcPr>
+            <w:tcW w:type="dxa" w:w="4565"/>
+            <w:vAlign w:val="center"/>
+            <w:tcMar>
+              <w:top w:w="65" w:type="dxa"/>
+              <w:start w:w="80" w:type="dxa"/>
+              <w:bottom w:w="65" w:type="dxa"/>
+              <w:end w:w="80" w:type="dxa"/>
+            </w:tcMar>
+            <w:shd w:val="clear" w:color="auto" w:fill="EEF4F5"/>
+          </w:tcPr>
+          <w:p>
+            <w:pPr>
+              <w:spacing w:before="0" w:after="0" w:line="240" w:lineRule="auto"/>
+            </w:pPr>
+            <w:r/>
+            <w:hyperlink r:id="rId41">
+              <w:r>
+                <w:rPr>
+                  <w:rFonts w:ascii="Carlito" w:hAnsi="Carlito"/>
+                  <w:color w:val="0563C1"/>
+                  <w:u w:val="single"/>
+                  <w:sz w:val="18"/>
+                  <w:szCs w:val="18"/>
+                </w:rPr>
+                <w:t>US$2,477 for a standard research article</w:t>
+              </w:r>
+            </w:hyperlink>
+          </w:p>
+        </w:tc>
+      </w:tr>
+      <w:tr>
+        <w:tc>
+          <w:tcPr>
+            <w:tcW w:type="dxa" w:w="2477"/>
+            <w:vAlign w:val="center"/>
+            <w:tcMar>
+              <w:top w:w="65" w:type="dxa"/>
+              <w:start w:w="80" w:type="dxa"/>
+              <w:bottom w:w="65" w:type="dxa"/>
+              <w:end w:w="80" w:type="dxa"/>
+            </w:tcMar>
+            <w:shd w:val="clear" w:color="auto" w:fill="FFFFFF"/>
+          </w:tcPr>
+          <w:p>
+            <w:pPr>
+              <w:spacing w:before="0" w:after="0" w:line="240" w:lineRule="auto"/>
+            </w:pPr>
+            <w:r>
+              <w:rPr>
+                <w:rFonts w:ascii="Carlito" w:hAnsi="Carlito"/>
+                <w:b/>
+                <w:sz w:val="18"/>
+              </w:rPr>
+              <w:t>G3: Genes|Genomes|Genetics</w:t>
+            </w:r>
+          </w:p>
+        </w:tc>
+        <w:tc>
+          <w:tcPr>
+            <w:tcW w:type="dxa" w:w="2952"/>
+            <w:vAlign w:val="center"/>
+            <w:tcMar>
+              <w:top w:w="65" w:type="dxa"/>
+              <w:start w:w="80" w:type="dxa"/>
+              <w:bottom w:w="65" w:type="dxa"/>
+              <w:end w:w="80" w:type="dxa"/>
+            </w:tcMar>
+            <w:shd w:val="clear" w:color="auto" w:fill="FFFFFF"/>
+          </w:tcPr>
+          <w:p>
+            <w:pPr>
+              <w:spacing w:before="0" w:after="0" w:line="240" w:lineRule="auto"/>
+            </w:pPr>
+            <w:r/>
+            <w:hyperlink r:id="rId42">
+              <w:r>
+                <w:rPr>
+                  <w:rFonts w:ascii="Carlito" w:hAnsi="Carlito"/>
+                  <w:color w:val="0563C1"/>
+                  <w:u w:val="single"/>
+                  <w:sz w:val="18"/>
+                  <w:szCs w:val="18"/>
+                </w:rPr>
+                <w:t>About 6 weeks (journal target)</w:t>
+              </w:r>
+            </w:hyperlink>
+          </w:p>
+        </w:tc>
+        <w:tc>
+          <w:tcPr>
+            <w:tcW w:type="dxa" w:w="4565"/>
+            <w:vAlign w:val="center"/>
+            <w:tcMar>
+              <w:top w:w="65" w:type="dxa"/>
+              <w:start w:w="80" w:type="dxa"/>
+              <w:bottom w:w="65" w:type="dxa"/>
+              <w:end w:w="80" w:type="dxa"/>
+            </w:tcMar>
+            <w:shd w:val="clear" w:color="auto" w:fill="FFFFFF"/>
+          </w:tcPr>
+          <w:p>
+            <w:pPr>
+              <w:spacing w:before="0" w:after="0" w:line="240" w:lineRule="auto"/>
+            </w:pPr>
+            <w:r/>
+            <w:hyperlink r:id="rId43">
+              <w:r>
+                <w:rPr>
+                  <w:rFonts w:ascii="Carlito" w:hAnsi="Carlito"/>
+                  <w:color w:val="0563C1"/>
+                  <w:u w:val="single"/>
+                  <w:sz w:val="18"/>
+                  <w:szCs w:val="18"/>
+                </w:rPr>
+                <w:t>US$3,625; 20% GSA-member discount gives US$2,900</w:t>
+              </w:r>
+            </w:hyperlink>
+          </w:p>
+        </w:tc>
+      </w:tr>
+      <w:tr>
+        <w:tc>
+          <w:tcPr>
+            <w:tcW w:type="dxa" w:w="2477"/>
+            <w:vAlign w:val="center"/>
+            <w:tcMar>
+              <w:top w:w="65" w:type="dxa"/>
+              <w:start w:w="80" w:type="dxa"/>
+              <w:bottom w:w="65" w:type="dxa"/>
+              <w:end w:w="80" w:type="dxa"/>
+            </w:tcMar>
+            <w:shd w:val="clear" w:color="auto" w:fill="EEF4F5"/>
+          </w:tcPr>
+          <w:p>
+            <w:pPr>
+              <w:spacing w:before="0" w:after="0" w:line="240" w:lineRule="auto"/>
+            </w:pPr>
+            <w:r>
+              <w:rPr>
+                <w:rFonts w:ascii="Carlito" w:hAnsi="Carlito"/>
+                <w:b/>
+                <w:sz w:val="18"/>
+              </w:rPr>
+              <w:t>PeerJ</w:t>
+            </w:r>
+          </w:p>
+        </w:tc>
+        <w:tc>
+          <w:tcPr>
+            <w:tcW w:type="dxa" w:w="2952"/>
+            <w:vAlign w:val="center"/>
+            <w:tcMar>
+              <w:top w:w="65" w:type="dxa"/>
+              <w:start w:w="80" w:type="dxa"/>
+              <w:bottom w:w="65" w:type="dxa"/>
+              <w:end w:w="80" w:type="dxa"/>
+            </w:tcMar>
+            <w:shd w:val="clear" w:color="auto" w:fill="EEF4F5"/>
+          </w:tcPr>
+          <w:p>
+            <w:pPr>
+              <w:spacing w:before="0" w:after="0" w:line="240" w:lineRule="auto"/>
+            </w:pPr>
+            <w:r/>
+            <w:hyperlink r:id="rId44">
+              <w:r>
+                <w:rPr>
+                  <w:rFonts w:ascii="Carlito" w:hAnsi="Carlito"/>
+                  <w:color w:val="0563C1"/>
+                  <w:u w:val="single"/>
+                  <w:sz w:val="18"/>
+                  <w:szCs w:val="18"/>
+                </w:rPr>
+                <w:t>32 days (journal factsheet)</w:t>
+              </w:r>
+            </w:hyperlink>
+          </w:p>
+        </w:tc>
+        <w:tc>
+          <w:tcPr>
+            <w:tcW w:type="dxa" w:w="4565"/>
+            <w:vAlign w:val="center"/>
+            <w:tcMar>
+              <w:top w:w="65" w:type="dxa"/>
+              <w:start w:w="80" w:type="dxa"/>
+              <w:bottom w:w="65" w:type="dxa"/>
+              <w:end w:w="80" w:type="dxa"/>
+            </w:tcMar>
+            <w:shd w:val="clear" w:color="auto" w:fill="EEF4F5"/>
+          </w:tcPr>
+          <w:p>
+            <w:pPr>
+              <w:spacing w:before="0" w:after="0" w:line="240" w:lineRule="auto"/>
+            </w:pPr>
+            <w:r/>
+            <w:hyperlink r:id="rId45">
+              <w:r>
+                <w:rPr>
+                  <w:rFonts w:ascii="Carlito" w:hAnsi="Carlito"/>
+                  <w:color w:val="0563C1"/>
+                  <w:u w:val="single"/>
+                  <w:sz w:val="18"/>
+                  <w:szCs w:val="18"/>
+                </w:rPr>
+                <w:t>US$2,155</w:t>
+              </w:r>
+            </w:hyperlink>
+          </w:p>
+        </w:tc>
+      </w:tr>
+      <w:tr>
+        <w:tc>
+          <w:tcPr>
+            <w:tcW w:type="dxa" w:w="2477"/>
+            <w:vAlign w:val="center"/>
+            <w:tcMar>
+              <w:top w:w="65" w:type="dxa"/>
+              <w:start w:w="80" w:type="dxa"/>
+              <w:bottom w:w="65" w:type="dxa"/>
+              <w:end w:w="80" w:type="dxa"/>
+            </w:tcMar>
+            <w:shd w:val="clear" w:color="auto" w:fill="FFFFFF"/>
+          </w:tcPr>
+          <w:p>
+            <w:pPr>
+              <w:spacing w:before="0" w:after="0" w:line="240" w:lineRule="auto"/>
+            </w:pPr>
+            <w:r>
+              <w:rPr>
+                <w:rFonts w:ascii="Carlito" w:hAnsi="Carlito"/>
+                <w:b/>
+                <w:sz w:val="18"/>
+              </w:rPr>
+              <w:t>Scientific Reports</w:t>
+            </w:r>
+          </w:p>
+        </w:tc>
+        <w:tc>
+          <w:tcPr>
+            <w:tcW w:type="dxa" w:w="2952"/>
+            <w:vAlign w:val="center"/>
+            <w:tcMar>
+              <w:top w:w="65" w:type="dxa"/>
+              <w:start w:w="80" w:type="dxa"/>
+              <w:bottom w:w="65" w:type="dxa"/>
+              <w:end w:w="80" w:type="dxa"/>
+            </w:tcMar>
+            <w:shd w:val="clear" w:color="auto" w:fill="FFFFFF"/>
+          </w:tcPr>
+          <w:p>
+            <w:pPr>
+              <w:spacing w:before="0" w:after="0" w:line="240" w:lineRule="auto"/>
+            </w:pPr>
+            <w:r/>
+            <w:hyperlink r:id="rId46">
+              <w:r>
+                <w:rPr>
+                  <w:rFonts w:ascii="Carlito" w:hAnsi="Carlito"/>
+                  <w:color w:val="0563C1"/>
+                  <w:u w:val="single"/>
+                  <w:sz w:val="18"/>
+                  <w:szCs w:val="18"/>
+                </w:rPr>
+                <w:t>Within 45 days (journal aim)</w:t>
+              </w:r>
+            </w:hyperlink>
+          </w:p>
+        </w:tc>
+        <w:tc>
+          <w:tcPr>
+            <w:tcW w:type="dxa" w:w="4565"/>
+            <w:vAlign w:val="center"/>
+            <w:tcMar>
+              <w:top w:w="65" w:type="dxa"/>
+              <w:start w:w="80" w:type="dxa"/>
+              <w:bottom w:w="65" w:type="dxa"/>
+              <w:end w:w="80" w:type="dxa"/>
+            </w:tcMar>
+            <w:shd w:val="clear" w:color="auto" w:fill="FFFFFF"/>
+          </w:tcPr>
+          <w:p>
+            <w:pPr>
+              <w:spacing w:before="0" w:after="0" w:line="240" w:lineRule="auto"/>
+            </w:pPr>
+            <w:r/>
+            <w:hyperlink r:id="rId47">
+              <w:r>
+                <w:rPr>
+                  <w:rFonts w:ascii="Carlito" w:hAnsi="Carlito"/>
+                  <w:color w:val="0563C1"/>
+                  <w:u w:val="single"/>
+                  <w:sz w:val="18"/>
+                  <w:szCs w:val="18"/>
+                </w:rPr>
+                <w:t>US$2,850 / £2,290 / €2,490</w:t>
+              </w:r>
+            </w:hyperlink>
+          </w:p>
+        </w:tc>
+      </w:tr>
+      <w:tr>
+        <w:tc>
+          <w:tcPr>
+            <w:tcW w:type="dxa" w:w="2477"/>
+            <w:vAlign w:val="center"/>
+            <w:tcMar>
+              <w:top w:w="65" w:type="dxa"/>
+              <w:start w:w="80" w:type="dxa"/>
+              <w:bottom w:w="65" w:type="dxa"/>
+              <w:end w:w="80" w:type="dxa"/>
+            </w:tcMar>
+            <w:shd w:val="clear" w:color="auto" w:fill="EEF4F5"/>
+          </w:tcPr>
+          <w:p>
+            <w:pPr>
+              <w:spacing w:before="0" w:after="0" w:line="240" w:lineRule="auto"/>
+            </w:pPr>
+            <w:r>
+              <w:rPr>
+                <w:rFonts w:ascii="Carlito" w:hAnsi="Carlito"/>
+                <w:b/>
+                <w:sz w:val="18"/>
+              </w:rPr>
+              <w:t>Frontiers in Plant Science</w:t>
+            </w:r>
+          </w:p>
+        </w:tc>
+        <w:tc>
+          <w:tcPr>
+            <w:tcW w:type="dxa" w:w="2952"/>
+            <w:vAlign w:val="center"/>
+            <w:tcMar>
+              <w:top w:w="65" w:type="dxa"/>
+              <w:start w:w="80" w:type="dxa"/>
+              <w:bottom w:w="65" w:type="dxa"/>
+              <w:end w:w="80" w:type="dxa"/>
+            </w:tcMar>
+            <w:shd w:val="clear" w:color="auto" w:fill="EEF4F5"/>
+          </w:tcPr>
+          <w:p>
+            <w:pPr>
+              <w:spacing w:before="0" w:after="0" w:line="240" w:lineRule="auto"/>
+            </w:pPr>
+            <w:r/>
+            <w:hyperlink r:id="rId48">
+              <w:r>
+                <w:rPr>
+                  <w:rFonts w:ascii="Carlito" w:hAnsi="Carlito"/>
+                  <w:color w:val="0563C1"/>
+                  <w:u w:val="single"/>
+                  <w:sz w:val="18"/>
+                  <w:szCs w:val="18"/>
+                </w:rPr>
+                <w:t>Not reported on the journal’s author pages</w:t>
+              </w:r>
+            </w:hyperlink>
+          </w:p>
+        </w:tc>
+        <w:tc>
+          <w:tcPr>
+            <w:tcW w:type="dxa" w:w="4565"/>
+            <w:vAlign w:val="center"/>
+            <w:tcMar>
+              <w:top w:w="65" w:type="dxa"/>
+              <w:start w:w="80" w:type="dxa"/>
+              <w:bottom w:w="65" w:type="dxa"/>
+              <w:end w:w="80" w:type="dxa"/>
+            </w:tcMar>
+            <w:shd w:val="clear" w:color="auto" w:fill="EEF4F5"/>
+          </w:tcPr>
+          <w:p>
+            <w:pPr>
+              <w:spacing w:before="0" w:after="0" w:line="240" w:lineRule="auto"/>
+            </w:pPr>
+            <w:r/>
+            <w:hyperlink r:id="rId49">
+              <w:r>
+                <w:rPr>
+                  <w:rFonts w:ascii="Carlito" w:hAnsi="Carlito"/>
+                  <w:color w:val="0563C1"/>
+                  <w:u w:val="single"/>
+                  <w:sz w:val="18"/>
+                  <w:szCs w:val="18"/>
+                </w:rPr>
+                <w:t>CHF 3,150 for Original Research (A-type article)</w:t>
+              </w:r>
+            </w:hyperlink>
+          </w:p>
+        </w:tc>
+      </w:tr>
+    </w:tbl>
+    <w:p>
+      <w:r>
+        <w:rPr>
+          <w:b/>
+        </w:rPr>
+        <w:t xml:space="preserve">How to read the times. </w:t>
+      </w:r>
+      <w:r>
+        <w:t>These figures are not perfectly comparable. A “first decision” may be a desk rejection, a revision request after peer review, or another editorial outcome; a very short median therefore does not mean that external peer review will finish that quickly. Where a publisher does not report a journal-specific figure, the table says so rather than substituting time to acceptance.</w:t>
+      </w:r>
+    </w:p>
+    <w:p>
+      <w:r>
+        <w:rPr>
+          <w:b/>
+        </w:rPr>
+        <w:t xml:space="preserve">What you may actually pay. </w:t>
+      </w:r>
+      <w:r>
+        <w:t xml:space="preserve">The listed amounts exclude taxes and reflect published list prices before waivers, society discounts, funder support, and institutional agreements. NYU is currently listed in Springer Nature’s BioMed Central agreement directory and in PLOS’s institutional-partner directory for PLOS ONE, so BMC Genomics, BMC Plant Biology, or PLOS ONE may cost you less—or potentially US$0—if the exact NYU Langone affiliation and article are approved. Confirm coverage in the submission/payment system; do not assume that NYU’s BMC listing covers Scientific Reports, which is a Nature Portfolio journal. </w:t>
+      </w:r>
+      <w:hyperlink r:id="rId50">
+        <w:r>
+          <w:rPr>
+            <w:rFonts w:ascii="Carlito" w:hAnsi="Carlito"/>
+            <w:color w:val="0563C1"/>
+            <w:u w:val="single"/>
+            <w:sz w:val="21"/>
+            <w:szCs w:val="21"/>
+          </w:rPr>
+          <w:t>Springer Nature agreement directory</w:t>
+        </w:r>
+      </w:hyperlink>
+      <w:r>
+        <w:t xml:space="preserve"> · </w:t>
+      </w:r>
+      <w:hyperlink r:id="rId51">
+        <w:r>
+          <w:rPr>
+            <w:rFonts w:ascii="Carlito" w:hAnsi="Carlito"/>
+            <w:color w:val="0563C1"/>
+            <w:u w:val="single"/>
+            <w:sz w:val="21"/>
+            <w:szCs w:val="21"/>
+          </w:rPr>
+          <w:t>PLOS institutional partners</w:t>
+        </w:r>
+      </w:hyperlink>
+    </w:p>
+    <w:p>
+      <w:r>
+        <w:rPr>
+          <w:b/>
+        </w:rPr>
+        <w:t xml:space="preserve">PhytoFrontiers length sensitivity. </w:t>
+      </w:r>
+      <w:r>
+        <w:t>Its charge is page-based. For scale only, if APS typesets the article at the current manuscript’s 27-page length, the fee would be about US$4,710 for an APS member or US$5,903 for a nonmember, plus US$80 per supplementary file. The actual published page count may differ substantially from the manuscript PDF.</w:t>
+      </w:r>
+    </w:p>
+    <w:p>
+      <w:pPr>
+        <w:pStyle w:val="Heading2"/>
+      </w:pPr>
+      <w:r>
+        <w:t>Priority ranking for fastest low-risk publication</w:t>
+      </w:r>
+    </w:p>
+    <w:p>
+      <w:r>
+        <w:rPr>
+          <w:b/>
+        </w:rPr>
+        <w:t xml:space="preserve">Recommended submission order. </w:t>
+      </w:r>
+      <w:r>
+        <w:t>This is a publication-probability ranking, not a prestige or price ranking. It weights scope fit, soundness-based review, and low risk of additional experiments more heavily than raw first-decision speed; turnaround breaks close calls.</w:t>
+      </w:r>
+    </w:p>
+    <w:tbl>
+      <w:tblPr>
+        <w:tblStyle w:val="LightShading-Accent1"/>
+        <w:tblW w:type="dxa" w:w="9994"/>
+        <w:jc w:val="center"/>
+        <w:tblLayout w:type="fixed"/>
+        <w:tblLook w:firstColumn="1" w:firstRow="1" w:lastColumn="0" w:lastRow="0" w:noHBand="0" w:noVBand="1" w:val="04A0"/>
+        <w:tblBorders>
+          <w:top w:val="single" w:sz="4" w:space="0" w:color="C9DADD"/>
+          <w:left w:val="single" w:sz="4" w:space="0" w:color="C9DADD"/>
+          <w:bottom w:val="single" w:sz="4" w:space="0" w:color="C9DADD"/>
+          <w:right w:val="single" w:sz="4" w:space="0" w:color="C9DADD"/>
+          <w:insideH w:val="single" w:sz="4" w:space="0" w:color="C9DADD"/>
+          <w:insideV w:val="single" w:sz="4" w:space="0" w:color="C9DADD"/>
+        </w:tblBorders>
+      </w:tblPr>
+      <w:tblGrid>
+        <w:gridCol w:w="749"/>
+        <w:gridCol w:w="2506"/>
+        <w:gridCol w:w="6739"/>
+      </w:tblGrid>
+      <w:tr>
+        <w:trPr>
+          <w:tblHeader w:val="true"/>
+        </w:trPr>
+        <w:tc>
+          <w:tcPr>
+            <w:tcW w:type="dxa" w:w="749"/>
+            <w:vAlign w:val="center"/>
+            <w:shd w:val="clear" w:color="auto" w:fill="1F6D7A"/>
+            <w:tcMar>
+              <w:top w:w="65" w:type="dxa"/>
+              <w:start w:w="80" w:type="dxa"/>
+              <w:bottom w:w="65" w:type="dxa"/>
+              <w:end w:w="80" w:type="dxa"/>
+            </w:tcMar>
+          </w:tcPr>
+          <w:p>
+            <w:pPr>
+              <w:spacing w:before="0" w:after="0" w:line="240" w:lineRule="auto"/>
+            </w:pPr>
+            <w:r>
+              <w:rPr>
+                <w:rFonts w:ascii="Carlito" w:hAnsi="Carlito"/>
+                <w:b/>
+                <w:color w:val="FFFFFF"/>
+                <w:sz w:val="18"/>
+              </w:rPr>
+              <w:t>Rank</w:t>
+            </w:r>
+          </w:p>
+        </w:tc>
+        <w:tc>
+          <w:tcPr>
+            <w:tcW w:type="dxa" w:w="2506"/>
+            <w:vAlign w:val="center"/>
+            <w:shd w:val="clear" w:color="auto" w:fill="1F6D7A"/>
+            <w:tcMar>
+              <w:top w:w="65" w:type="dxa"/>
+              <w:start w:w="80" w:type="dxa"/>
+              <w:bottom w:w="65" w:type="dxa"/>
+              <w:end w:w="80" w:type="dxa"/>
+            </w:tcMar>
+          </w:tcPr>
+          <w:p>
+            <w:pPr>
+              <w:spacing w:before="0" w:after="0" w:line="240" w:lineRule="auto"/>
+            </w:pPr>
+            <w:r>
+              <w:rPr>
+                <w:rFonts w:ascii="Carlito" w:hAnsi="Carlito"/>
+                <w:b/>
+                <w:color w:val="FFFFFF"/>
+                <w:sz w:val="18"/>
+              </w:rPr>
+              <w:t>Journal</w:t>
+            </w:r>
+          </w:p>
+        </w:tc>
+        <w:tc>
+          <w:tcPr>
+            <w:tcW w:type="dxa" w:w="6739"/>
+            <w:vAlign w:val="center"/>
+            <w:shd w:val="clear" w:color="auto" w:fill="1F6D7A"/>
+            <w:tcMar>
+              <w:top w:w="65" w:type="dxa"/>
+              <w:start w:w="80" w:type="dxa"/>
+              <w:bottom w:w="65" w:type="dxa"/>
+              <w:end w:w="80" w:type="dxa"/>
+            </w:tcMar>
+          </w:tcPr>
+          <w:p>
+            <w:pPr>
+              <w:spacing w:before="0" w:after="0" w:line="240" w:lineRule="auto"/>
+            </w:pPr>
+            <w:r>
+              <w:rPr>
+                <w:rFonts w:ascii="Carlito" w:hAnsi="Carlito"/>
+                <w:b/>
+                <w:color w:val="FFFFFF"/>
+                <w:sz w:val="18"/>
+              </w:rPr>
+              <w:t>Why it falls here</w:t>
+            </w:r>
+          </w:p>
+        </w:tc>
+      </w:tr>
+      <w:tr>
+        <w:tc>
+          <w:tcPr>
+            <w:tcW w:type="dxa" w:w="749"/>
+            <w:vAlign w:val="center"/>
+            <w:shd w:val="clear" w:color="auto" w:fill="FFFFFF"/>
+            <w:tcMar>
+              <w:top w:w="65" w:type="dxa"/>
+              <w:start w:w="80" w:type="dxa"/>
+              <w:bottom w:w="65" w:type="dxa"/>
+              <w:end w:w="80" w:type="dxa"/>
+            </w:tcMar>
+          </w:tcPr>
+          <w:p>
+            <w:pPr>
+              <w:spacing w:before="0" w:after="0" w:line="240" w:lineRule="auto"/>
+            </w:pPr>
+            <w:r>
+              <w:rPr>
+                <w:rFonts w:ascii="Carlito" w:hAnsi="Carlito"/>
+                <w:b/>
+                <w:sz w:val="18"/>
+              </w:rPr>
+              <w:t>1</w:t>
+            </w:r>
+          </w:p>
+        </w:tc>
+        <w:tc>
+          <w:tcPr>
+            <w:tcW w:type="dxa" w:w="2506"/>
+            <w:vAlign w:val="center"/>
+            <w:shd w:val="clear" w:color="auto" w:fill="FFFFFF"/>
+            <w:tcMar>
+              <w:top w:w="65" w:type="dxa"/>
+              <w:start w:w="80" w:type="dxa"/>
+              <w:bottom w:w="65" w:type="dxa"/>
+              <w:end w:w="80" w:type="dxa"/>
+            </w:tcMar>
+          </w:tcPr>
+          <w:p>
+            <w:pPr>
+              <w:spacing w:before="0" w:after="0" w:line="240" w:lineRule="auto"/>
+            </w:pPr>
+            <w:r>
+              <w:rPr>
+                <w:rFonts w:ascii="Carlito" w:hAnsi="Carlito"/>
+                <w:b/>
+                <w:sz w:val="18"/>
+              </w:rPr>
+              <w:t>Plant Direct</w:t>
+            </w:r>
+          </w:p>
+        </w:tc>
+        <w:tc>
+          <w:tcPr>
+            <w:tcW w:type="dxa" w:w="6739"/>
+            <w:vAlign w:val="center"/>
+            <w:shd w:val="clear" w:color="auto" w:fill="FFFFFF"/>
+            <w:tcMar>
+              <w:top w:w="65" w:type="dxa"/>
+              <w:start w:w="80" w:type="dxa"/>
+              <w:bottom w:w="65" w:type="dxa"/>
+              <w:end w:w="80" w:type="dxa"/>
+            </w:tcMar>
+          </w:tcPr>
+          <w:p>
+            <w:pPr>
+              <w:spacing w:before="0" w:after="0" w:line="240" w:lineRule="auto"/>
+            </w:pPr>
+            <w:r>
+              <w:rPr>
+                <w:rFonts w:ascii="Carlito" w:hAnsi="Carlito"/>
+                <w:sz w:val="18"/>
+              </w:rPr>
+              <w:t>Best overall balance: exact plant-science fit, sound-science editorial model, low experimental-request risk, and a 31-day median first decision.</w:t>
+            </w:r>
+          </w:p>
+        </w:tc>
+      </w:tr>
+      <w:tr>
+        <w:tc>
+          <w:tcPr>
+            <w:tcW w:type="dxa" w:w="749"/>
+            <w:vAlign w:val="center"/>
+            <w:shd w:val="clear" w:color="auto" w:fill="EEF4F5"/>
+            <w:tcMar>
+              <w:top w:w="65" w:type="dxa"/>
+              <w:start w:w="80" w:type="dxa"/>
+              <w:bottom w:w="65" w:type="dxa"/>
+              <w:end w:w="80" w:type="dxa"/>
+            </w:tcMar>
+          </w:tcPr>
+          <w:p>
+            <w:pPr>
+              <w:spacing w:before="0" w:after="0" w:line="240" w:lineRule="auto"/>
+            </w:pPr>
+            <w:r>
+              <w:rPr>
+                <w:rFonts w:ascii="Carlito" w:hAnsi="Carlito"/>
+                <w:b/>
+                <w:sz w:val="18"/>
+              </w:rPr>
+              <w:t>2</w:t>
+            </w:r>
+          </w:p>
+        </w:tc>
+        <w:tc>
+          <w:tcPr>
+            <w:tcW w:type="dxa" w:w="2506"/>
+            <w:vAlign w:val="center"/>
+            <w:shd w:val="clear" w:color="auto" w:fill="EEF4F5"/>
+            <w:tcMar>
+              <w:top w:w="65" w:type="dxa"/>
+              <w:start w:w="80" w:type="dxa"/>
+              <w:bottom w:w="65" w:type="dxa"/>
+              <w:end w:w="80" w:type="dxa"/>
+            </w:tcMar>
+          </w:tcPr>
+          <w:p>
+            <w:pPr>
+              <w:spacing w:before="0" w:after="0" w:line="240" w:lineRule="auto"/>
+            </w:pPr>
+            <w:r>
+              <w:rPr>
+                <w:rFonts w:ascii="Carlito" w:hAnsi="Carlito"/>
+                <w:b/>
+                <w:sz w:val="18"/>
+              </w:rPr>
+              <w:t>Royal Society Open Science</w:t>
+            </w:r>
+          </w:p>
+        </w:tc>
+        <w:tc>
+          <w:tcPr>
+            <w:tcW w:type="dxa" w:w="6739"/>
+            <w:vAlign w:val="center"/>
+            <w:shd w:val="clear" w:color="auto" w:fill="EEF4F5"/>
+            <w:tcMar>
+              <w:top w:w="65" w:type="dxa"/>
+              <w:start w:w="80" w:type="dxa"/>
+              <w:bottom w:w="65" w:type="dxa"/>
+              <w:end w:w="80" w:type="dxa"/>
+            </w:tcMar>
+          </w:tcPr>
+          <w:p>
+            <w:pPr>
+              <w:spacing w:before="0" w:after="0" w:line="240" w:lineRule="auto"/>
+            </w:pPr>
+            <w:r>
+              <w:rPr>
+                <w:rFonts w:ascii="Carlito" w:hAnsi="Carlito"/>
+                <w:sz w:val="18"/>
+              </w:rPr>
+              <w:t>Low experimental-request risk and a 19-day median first decision. Broad scope makes it the fastest strong fallback after Plant Direct.</w:t>
+            </w:r>
+          </w:p>
+        </w:tc>
+      </w:tr>
+      <w:tr>
+        <w:tc>
+          <w:tcPr>
+            <w:tcW w:type="dxa" w:w="749"/>
+            <w:vAlign w:val="center"/>
+            <w:shd w:val="clear" w:color="auto" w:fill="FFFFFF"/>
+            <w:tcMar>
+              <w:top w:w="65" w:type="dxa"/>
+              <w:start w:w="80" w:type="dxa"/>
+              <w:bottom w:w="65" w:type="dxa"/>
+              <w:end w:w="80" w:type="dxa"/>
+            </w:tcMar>
+          </w:tcPr>
+          <w:p>
+            <w:pPr>
+              <w:spacing w:before="0" w:after="0" w:line="240" w:lineRule="auto"/>
+            </w:pPr>
+            <w:r>
+              <w:rPr>
+                <w:rFonts w:ascii="Carlito" w:hAnsi="Carlito"/>
+                <w:b/>
+                <w:sz w:val="18"/>
+              </w:rPr>
+              <w:t>3</w:t>
+            </w:r>
+          </w:p>
+        </w:tc>
+        <w:tc>
+          <w:tcPr>
+            <w:tcW w:type="dxa" w:w="2506"/>
+            <w:vAlign w:val="center"/>
+            <w:shd w:val="clear" w:color="auto" w:fill="FFFFFF"/>
+            <w:tcMar>
+              <w:top w:w="65" w:type="dxa"/>
+              <w:start w:w="80" w:type="dxa"/>
+              <w:bottom w:w="65" w:type="dxa"/>
+              <w:end w:w="80" w:type="dxa"/>
+            </w:tcMar>
+          </w:tcPr>
+          <w:p>
+            <w:pPr>
+              <w:spacing w:before="0" w:after="0" w:line="240" w:lineRule="auto"/>
+            </w:pPr>
+            <w:r>
+              <w:rPr>
+                <w:rFonts w:ascii="Carlito" w:hAnsi="Carlito"/>
+                <w:b/>
+                <w:sz w:val="18"/>
+              </w:rPr>
+              <w:t>PeerJ</w:t>
+            </w:r>
+          </w:p>
+        </w:tc>
+        <w:tc>
+          <w:tcPr>
+            <w:tcW w:type="dxa" w:w="6739"/>
+            <w:vAlign w:val="center"/>
+            <w:shd w:val="clear" w:color="auto" w:fill="FFFFFF"/>
+            <w:tcMar>
+              <w:top w:w="65" w:type="dxa"/>
+              <w:start w:w="80" w:type="dxa"/>
+              <w:bottom w:w="65" w:type="dxa"/>
+              <w:end w:w="80" w:type="dxa"/>
+            </w:tcMar>
+          </w:tcPr>
+          <w:p>
+            <w:pPr>
+              <w:spacing w:before="0" w:after="0" w:line="240" w:lineRule="auto"/>
+            </w:pPr>
+            <w:r>
+              <w:rPr>
+                <w:rFonts w:ascii="Carlito" w:hAnsi="Carlito"/>
+                <w:sz w:val="18"/>
+              </w:rPr>
+              <w:t>Soundness-oriented review, low experimental-request risk, and a 32-day first-decision figure. Strong probability-focused fallback.</w:t>
+            </w:r>
+          </w:p>
+        </w:tc>
+      </w:tr>
+      <w:tr>
+        <w:tc>
+          <w:tcPr>
+            <w:tcW w:type="dxa" w:w="749"/>
+            <w:vAlign w:val="center"/>
+            <w:shd w:val="clear" w:color="auto" w:fill="EEF4F5"/>
+            <w:tcMar>
+              <w:top w:w="65" w:type="dxa"/>
+              <w:start w:w="80" w:type="dxa"/>
+              <w:bottom w:w="65" w:type="dxa"/>
+              <w:end w:w="80" w:type="dxa"/>
+            </w:tcMar>
+          </w:tcPr>
+          <w:p>
+            <w:pPr>
+              <w:spacing w:before="0" w:after="0" w:line="240" w:lineRule="auto"/>
+            </w:pPr>
+            <w:r>
+              <w:rPr>
+                <w:rFonts w:ascii="Carlito" w:hAnsi="Carlito"/>
+                <w:b/>
+                <w:sz w:val="18"/>
+              </w:rPr>
+              <w:t>4</w:t>
+            </w:r>
+          </w:p>
+        </w:tc>
+        <w:tc>
+          <w:tcPr>
+            <w:tcW w:type="dxa" w:w="2506"/>
+            <w:vAlign w:val="center"/>
+            <w:shd w:val="clear" w:color="auto" w:fill="EEF4F5"/>
+            <w:tcMar>
+              <w:top w:w="65" w:type="dxa"/>
+              <w:start w:w="80" w:type="dxa"/>
+              <w:bottom w:w="65" w:type="dxa"/>
+              <w:end w:w="80" w:type="dxa"/>
+            </w:tcMar>
+          </w:tcPr>
+          <w:p>
+            <w:pPr>
+              <w:spacing w:before="0" w:after="0" w:line="240" w:lineRule="auto"/>
+            </w:pPr>
+            <w:r>
+              <w:rPr>
+                <w:rFonts w:ascii="Carlito" w:hAnsi="Carlito"/>
+                <w:b/>
+                <w:sz w:val="18"/>
+              </w:rPr>
+              <w:t>PhytoFrontiers</w:t>
+            </w:r>
+          </w:p>
+        </w:tc>
+        <w:tc>
+          <w:tcPr>
+            <w:tcW w:type="dxa" w:w="6739"/>
+            <w:vAlign w:val="center"/>
+            <w:shd w:val="clear" w:color="auto" w:fill="EEF4F5"/>
+            <w:tcMar>
+              <w:top w:w="65" w:type="dxa"/>
+              <w:start w:w="80" w:type="dxa"/>
+              <w:bottom w:w="65" w:type="dxa"/>
+              <w:end w:w="80" w:type="dxa"/>
+            </w:tcMar>
+          </w:tcPr>
+          <w:p>
+            <w:pPr>
+              <w:spacing w:before="0" w:after="0" w:line="240" w:lineRule="auto"/>
+            </w:pPr>
+            <w:r>
+              <w:rPr>
+                <w:rFonts w:ascii="Carlito" w:hAnsi="Carlito"/>
+                <w:sz w:val="18"/>
+              </w:rPr>
+              <w:t>Excellent plant-pathology fit and low experimental-request risk, including openness to negative results. Ranked below the top three because no journal-specific decision time is published.</w:t>
+            </w:r>
+          </w:p>
+        </w:tc>
+      </w:tr>
+      <w:tr>
+        <w:tc>
+          <w:tcPr>
+            <w:tcW w:type="dxa" w:w="749"/>
+            <w:vAlign w:val="center"/>
+            <w:shd w:val="clear" w:color="auto" w:fill="FFFFFF"/>
+            <w:tcMar>
+              <w:top w:w="65" w:type="dxa"/>
+              <w:start w:w="80" w:type="dxa"/>
+              <w:bottom w:w="65" w:type="dxa"/>
+              <w:end w:w="80" w:type="dxa"/>
+            </w:tcMar>
+          </w:tcPr>
+          <w:p>
+            <w:pPr>
+              <w:spacing w:before="0" w:after="0" w:line="240" w:lineRule="auto"/>
+            </w:pPr>
+            <w:r>
+              <w:rPr>
+                <w:rFonts w:ascii="Carlito" w:hAnsi="Carlito"/>
+                <w:b/>
+                <w:sz w:val="18"/>
+              </w:rPr>
+              <w:t>5</w:t>
+            </w:r>
+          </w:p>
+        </w:tc>
+        <w:tc>
+          <w:tcPr>
+            <w:tcW w:type="dxa" w:w="2506"/>
+            <w:vAlign w:val="center"/>
+            <w:shd w:val="clear" w:color="auto" w:fill="FFFFFF"/>
+            <w:tcMar>
+              <w:top w:w="65" w:type="dxa"/>
+              <w:start w:w="80" w:type="dxa"/>
+              <w:bottom w:w="65" w:type="dxa"/>
+              <w:end w:w="80" w:type="dxa"/>
+            </w:tcMar>
+          </w:tcPr>
+          <w:p>
+            <w:pPr>
+              <w:spacing w:before="0" w:after="0" w:line="240" w:lineRule="auto"/>
+            </w:pPr>
+            <w:r>
+              <w:rPr>
+                <w:rFonts w:ascii="Carlito" w:hAnsi="Carlito"/>
+                <w:b/>
+                <w:sz w:val="18"/>
+              </w:rPr>
+              <w:t>PLOS ONE</w:t>
+            </w:r>
+          </w:p>
+        </w:tc>
+        <w:tc>
+          <w:tcPr>
+            <w:tcW w:type="dxa" w:w="6739"/>
+            <w:vAlign w:val="center"/>
+            <w:shd w:val="clear" w:color="auto" w:fill="FFFFFF"/>
+            <w:tcMar>
+              <w:top w:w="65" w:type="dxa"/>
+              <w:start w:w="80" w:type="dxa"/>
+              <w:bottom w:w="65" w:type="dxa"/>
+              <w:end w:w="80" w:type="dxa"/>
+            </w:tcMar>
+          </w:tcPr>
+          <w:p>
+            <w:pPr>
+              <w:spacing w:before="0" w:after="0" w:line="240" w:lineRule="auto"/>
+            </w:pPr>
+            <w:r>
+              <w:rPr>
+                <w:rFonts w:ascii="Carlito" w:hAnsi="Carlito"/>
+                <w:sz w:val="18"/>
+              </w:rPr>
+              <w:t>Low novelty and scope risk, but the published median first-decision figure is 45 days and the latest journal timing table is from Jan–Jun 2023.</w:t>
+            </w:r>
+          </w:p>
+        </w:tc>
+      </w:tr>
+      <w:tr>
+        <w:tc>
+          <w:tcPr>
+            <w:tcW w:type="dxa" w:w="749"/>
+            <w:vAlign w:val="center"/>
+            <w:shd w:val="clear" w:color="auto" w:fill="EEF4F5"/>
+            <w:tcMar>
+              <w:top w:w="65" w:type="dxa"/>
+              <w:start w:w="80" w:type="dxa"/>
+              <w:bottom w:w="65" w:type="dxa"/>
+              <w:end w:w="80" w:type="dxa"/>
+            </w:tcMar>
+          </w:tcPr>
+          <w:p>
+            <w:pPr>
+              <w:spacing w:before="0" w:after="0" w:line="240" w:lineRule="auto"/>
+            </w:pPr>
+            <w:r>
+              <w:rPr>
+                <w:rFonts w:ascii="Carlito" w:hAnsi="Carlito"/>
+                <w:b/>
+                <w:sz w:val="18"/>
+              </w:rPr>
+              <w:t>6</w:t>
+            </w:r>
+          </w:p>
+        </w:tc>
+        <w:tc>
+          <w:tcPr>
+            <w:tcW w:type="dxa" w:w="2506"/>
+            <w:vAlign w:val="center"/>
+            <w:shd w:val="clear" w:color="auto" w:fill="EEF4F5"/>
+            <w:tcMar>
+              <w:top w:w="65" w:type="dxa"/>
+              <w:start w:w="80" w:type="dxa"/>
+              <w:bottom w:w="65" w:type="dxa"/>
+              <w:end w:w="80" w:type="dxa"/>
+            </w:tcMar>
+          </w:tcPr>
+          <w:p>
+            <w:pPr>
+              <w:spacing w:before="0" w:after="0" w:line="240" w:lineRule="auto"/>
+            </w:pPr>
+            <w:r>
+              <w:rPr>
+                <w:rFonts w:ascii="Carlito" w:hAnsi="Carlito"/>
+                <w:b/>
+                <w:sz w:val="18"/>
+              </w:rPr>
+              <w:t>BMC Genomics</w:t>
+            </w:r>
+          </w:p>
+        </w:tc>
+        <w:tc>
+          <w:tcPr>
+            <w:tcW w:type="dxa" w:w="6739"/>
+            <w:vAlign w:val="center"/>
+            <w:shd w:val="clear" w:color="auto" w:fill="EEF4F5"/>
+            <w:tcMar>
+              <w:top w:w="65" w:type="dxa"/>
+              <w:start w:w="80" w:type="dxa"/>
+              <w:bottom w:w="65" w:type="dxa"/>
+              <w:end w:w="80" w:type="dxa"/>
+            </w:tcMar>
+          </w:tcPr>
+          <w:p>
+            <w:pPr>
+              <w:spacing w:before="0" w:after="0" w:line="240" w:lineRule="auto"/>
+            </w:pPr>
+            <w:r>
+              <w:rPr>
+                <w:rFonts w:ascii="Carlito" w:hAnsi="Carlito"/>
+                <w:sz w:val="18"/>
+              </w:rPr>
+              <w:t>Very fast 4-day median first decision and a relevant collection, but greater risk of desk rejection or demands for a broader genomic contribution. The headline metric includes rapid editorial outcomes.</w:t>
+            </w:r>
+          </w:p>
+        </w:tc>
+      </w:tr>
+      <w:tr>
+        <w:tc>
+          <w:tcPr>
+            <w:tcW w:type="dxa" w:w="749"/>
+            <w:vAlign w:val="center"/>
+            <w:shd w:val="clear" w:color="auto" w:fill="FFFFFF"/>
+            <w:tcMar>
+              <w:top w:w="65" w:type="dxa"/>
+              <w:start w:w="80" w:type="dxa"/>
+              <w:bottom w:w="65" w:type="dxa"/>
+              <w:end w:w="80" w:type="dxa"/>
+            </w:tcMar>
+          </w:tcPr>
+          <w:p>
+            <w:pPr>
+              <w:spacing w:before="0" w:after="0" w:line="240" w:lineRule="auto"/>
+            </w:pPr>
+            <w:r>
+              <w:rPr>
+                <w:rFonts w:ascii="Carlito" w:hAnsi="Carlito"/>
+                <w:b/>
+                <w:sz w:val="18"/>
+              </w:rPr>
+              <w:t>7</w:t>
+            </w:r>
+          </w:p>
+        </w:tc>
+        <w:tc>
+          <w:tcPr>
+            <w:tcW w:type="dxa" w:w="2506"/>
+            <w:vAlign w:val="center"/>
+            <w:shd w:val="clear" w:color="auto" w:fill="FFFFFF"/>
+            <w:tcMar>
+              <w:top w:w="65" w:type="dxa"/>
+              <w:start w:w="80" w:type="dxa"/>
+              <w:bottom w:w="65" w:type="dxa"/>
+              <w:end w:w="80" w:type="dxa"/>
+            </w:tcMar>
+          </w:tcPr>
+          <w:p>
+            <w:pPr>
+              <w:spacing w:before="0" w:after="0" w:line="240" w:lineRule="auto"/>
+            </w:pPr>
+            <w:r>
+              <w:rPr>
+                <w:rFonts w:ascii="Carlito" w:hAnsi="Carlito"/>
+                <w:b/>
+                <w:sz w:val="18"/>
+              </w:rPr>
+              <w:t>BMC Plant Biology</w:t>
+            </w:r>
+          </w:p>
+        </w:tc>
+        <w:tc>
+          <w:tcPr>
+            <w:tcW w:type="dxa" w:w="6739"/>
+            <w:vAlign w:val="center"/>
+            <w:shd w:val="clear" w:color="auto" w:fill="FFFFFF"/>
+            <w:tcMar>
+              <w:top w:w="65" w:type="dxa"/>
+              <w:start w:w="80" w:type="dxa"/>
+              <w:bottom w:w="65" w:type="dxa"/>
+              <w:end w:w="80" w:type="dxa"/>
+            </w:tcMar>
+          </w:tcPr>
+          <w:p>
+            <w:pPr>
+              <w:spacing w:before="0" w:after="0" w:line="240" w:lineRule="auto"/>
+            </w:pPr>
+            <w:r>
+              <w:rPr>
+                <w:rFonts w:ascii="Carlito" w:hAnsi="Carlito"/>
+                <w:sz w:val="18"/>
+              </w:rPr>
+              <w:t>An 11-day median first decision, but moderate risk of requests for mechanistic or experimental support makes successful publication less predictable.</w:t>
+            </w:r>
+          </w:p>
+        </w:tc>
+      </w:tr>
+      <w:tr>
+        <w:tc>
+          <w:tcPr>
+            <w:tcW w:type="dxa" w:w="749"/>
+            <w:vAlign w:val="center"/>
+            <w:shd w:val="clear" w:color="auto" w:fill="EEF4F5"/>
+            <w:tcMar>
+              <w:top w:w="65" w:type="dxa"/>
+              <w:start w:w="80" w:type="dxa"/>
+              <w:bottom w:w="65" w:type="dxa"/>
+              <w:end w:w="80" w:type="dxa"/>
+            </w:tcMar>
+          </w:tcPr>
+          <w:p>
+            <w:pPr>
+              <w:spacing w:before="0" w:after="0" w:line="240" w:lineRule="auto"/>
+            </w:pPr>
+            <w:r>
+              <w:rPr>
+                <w:rFonts w:ascii="Carlito" w:hAnsi="Carlito"/>
+                <w:b/>
+                <w:sz w:val="18"/>
+              </w:rPr>
+              <w:t>8</w:t>
+            </w:r>
+          </w:p>
+        </w:tc>
+        <w:tc>
+          <w:tcPr>
+            <w:tcW w:type="dxa" w:w="2506"/>
+            <w:vAlign w:val="center"/>
+            <w:shd w:val="clear" w:color="auto" w:fill="EEF4F5"/>
+            <w:tcMar>
+              <w:top w:w="65" w:type="dxa"/>
+              <w:start w:w="80" w:type="dxa"/>
+              <w:bottom w:w="65" w:type="dxa"/>
+              <w:end w:w="80" w:type="dxa"/>
+            </w:tcMar>
+          </w:tcPr>
+          <w:p>
+            <w:pPr>
+              <w:spacing w:before="0" w:after="0" w:line="240" w:lineRule="auto"/>
+            </w:pPr>
+            <w:r>
+              <w:rPr>
+                <w:rFonts w:ascii="Carlito" w:hAnsi="Carlito"/>
+                <w:b/>
+                <w:sz w:val="18"/>
+              </w:rPr>
+              <w:t>G3: Genes|Genomes|Genetics</w:t>
+            </w:r>
+          </w:p>
+        </w:tc>
+        <w:tc>
+          <w:tcPr>
+            <w:tcW w:type="dxa" w:w="6739"/>
+            <w:vAlign w:val="center"/>
+            <w:shd w:val="clear" w:color="auto" w:fill="EEF4F5"/>
+            <w:tcMar>
+              <w:top w:w="65" w:type="dxa"/>
+              <w:start w:w="80" w:type="dxa"/>
+              <w:bottom w:w="65" w:type="dxa"/>
+              <w:end w:w="80" w:type="dxa"/>
+            </w:tcMar>
+          </w:tcPr>
+          <w:p>
+            <w:pPr>
+              <w:spacing w:before="0" w:after="0" w:line="240" w:lineRule="auto"/>
+            </w:pPr>
+            <w:r>
+              <w:rPr>
+                <w:rFonts w:ascii="Carlito" w:hAnsi="Carlito"/>
+                <w:sz w:val="18"/>
+              </w:rPr>
+              <w:t>About a 6-week initial-decision target and moderate risk that reviewers will expect a stronger genetics contribution or additional support.</w:t>
+            </w:r>
+          </w:p>
+        </w:tc>
+      </w:tr>
+      <w:tr>
+        <w:tc>
+          <w:tcPr>
+            <w:tcW w:type="dxa" w:w="749"/>
+            <w:vAlign w:val="center"/>
+            <w:shd w:val="clear" w:color="auto" w:fill="FFFFFF"/>
+            <w:tcMar>
+              <w:top w:w="65" w:type="dxa"/>
+              <w:start w:w="80" w:type="dxa"/>
+              <w:bottom w:w="65" w:type="dxa"/>
+              <w:end w:w="80" w:type="dxa"/>
+            </w:tcMar>
+          </w:tcPr>
+          <w:p>
+            <w:pPr>
+              <w:spacing w:before="0" w:after="0" w:line="240" w:lineRule="auto"/>
+            </w:pPr>
+            <w:r>
+              <w:rPr>
+                <w:rFonts w:ascii="Carlito" w:hAnsi="Carlito"/>
+                <w:b/>
+                <w:sz w:val="18"/>
+              </w:rPr>
+              <w:t>9</w:t>
+            </w:r>
+          </w:p>
+        </w:tc>
+        <w:tc>
+          <w:tcPr>
+            <w:tcW w:type="dxa" w:w="2506"/>
+            <w:vAlign w:val="center"/>
+            <w:shd w:val="clear" w:color="auto" w:fill="FFFFFF"/>
+            <w:tcMar>
+              <w:top w:w="65" w:type="dxa"/>
+              <w:start w:w="80" w:type="dxa"/>
+              <w:bottom w:w="65" w:type="dxa"/>
+              <w:end w:w="80" w:type="dxa"/>
+            </w:tcMar>
+          </w:tcPr>
+          <w:p>
+            <w:pPr>
+              <w:spacing w:before="0" w:after="0" w:line="240" w:lineRule="auto"/>
+            </w:pPr>
+            <w:r>
+              <w:rPr>
+                <w:rFonts w:ascii="Carlito" w:hAnsi="Carlito"/>
+                <w:b/>
+                <w:sz w:val="18"/>
+              </w:rPr>
+              <w:t>Scientific Reports</w:t>
+            </w:r>
+          </w:p>
+        </w:tc>
+        <w:tc>
+          <w:tcPr>
+            <w:tcW w:type="dxa" w:w="6739"/>
+            <w:vAlign w:val="center"/>
+            <w:shd w:val="clear" w:color="auto" w:fill="FFFFFF"/>
+            <w:tcMar>
+              <w:top w:w="65" w:type="dxa"/>
+              <w:start w:w="80" w:type="dxa"/>
+              <w:bottom w:w="65" w:type="dxa"/>
+              <w:end w:w="80" w:type="dxa"/>
+            </w:tcMar>
+          </w:tcPr>
+          <w:p>
+            <w:pPr>
+              <w:spacing w:before="0" w:after="0" w:line="240" w:lineRule="auto"/>
+            </w:pPr>
+            <w:r>
+              <w:rPr>
+                <w:rFonts w:ascii="Carlito" w:hAnsi="Carlito"/>
+                <w:sz w:val="18"/>
+              </w:rPr>
+              <w:t>A 45-day first-decision aim, with moderate editorial and reviewer risk for a secondary computational analysis.</w:t>
+            </w:r>
+          </w:p>
+        </w:tc>
+      </w:tr>
+      <w:tr>
+        <w:tc>
+          <w:tcPr>
+            <w:tcW w:type="dxa" w:w="749"/>
+            <w:vAlign w:val="center"/>
+            <w:shd w:val="clear" w:color="auto" w:fill="EEF4F5"/>
+            <w:tcMar>
+              <w:top w:w="65" w:type="dxa"/>
+              <w:start w:w="80" w:type="dxa"/>
+              <w:bottom w:w="65" w:type="dxa"/>
+              <w:end w:w="80" w:type="dxa"/>
+            </w:tcMar>
+          </w:tcPr>
+          <w:p>
+            <w:pPr>
+              <w:spacing w:before="0" w:after="0" w:line="240" w:lineRule="auto"/>
+            </w:pPr>
+            <w:r>
+              <w:rPr>
+                <w:rFonts w:ascii="Carlito" w:hAnsi="Carlito"/>
+                <w:b/>
+                <w:sz w:val="18"/>
+              </w:rPr>
+              <w:t>10</w:t>
+            </w:r>
+          </w:p>
+        </w:tc>
+        <w:tc>
+          <w:tcPr>
+            <w:tcW w:type="dxa" w:w="2506"/>
+            <w:vAlign w:val="center"/>
+            <w:shd w:val="clear" w:color="auto" w:fill="EEF4F5"/>
+            <w:tcMar>
+              <w:top w:w="65" w:type="dxa"/>
+              <w:start w:w="80" w:type="dxa"/>
+              <w:bottom w:w="65" w:type="dxa"/>
+              <w:end w:w="80" w:type="dxa"/>
+            </w:tcMar>
+          </w:tcPr>
+          <w:p>
+            <w:pPr>
+              <w:spacing w:before="0" w:after="0" w:line="240" w:lineRule="auto"/>
+            </w:pPr>
+            <w:r>
+              <w:rPr>
+                <w:rFonts w:ascii="Carlito" w:hAnsi="Carlito"/>
+                <w:b/>
+                <w:sz w:val="18"/>
+              </w:rPr>
+              <w:t>Frontiers in Plant Science</w:t>
+            </w:r>
+          </w:p>
+        </w:tc>
+        <w:tc>
+          <w:tcPr>
+            <w:tcW w:type="dxa" w:w="6739"/>
+            <w:vAlign w:val="center"/>
+            <w:shd w:val="clear" w:color="auto" w:fill="EEF4F5"/>
+            <w:tcMar>
+              <w:top w:w="65" w:type="dxa"/>
+              <w:start w:w="80" w:type="dxa"/>
+              <w:bottom w:w="65" w:type="dxa"/>
+              <w:end w:w="80" w:type="dxa"/>
+            </w:tcMar>
+          </w:tcPr>
+          <w:p>
+            <w:pPr>
+              <w:spacing w:before="0" w:after="0" w:line="240" w:lineRule="auto"/>
+            </w:pPr>
+            <w:r>
+              <w:rPr>
+                <w:rFonts w:ascii="Carlito" w:hAnsi="Carlito"/>
+                <w:sz w:val="18"/>
+              </w:rPr>
+              <w:t>No journal-specific first-decision time is published, and the estimated risk of additional mechanistic or wet-lab requests is medium to high.</w:t>
+            </w:r>
+          </w:p>
+        </w:tc>
+      </w:tr>
+    </w:tbl>
+    <w:p>
+      <w:r>
+        <w:rPr>
+          <w:b/>
+        </w:rPr>
+        <w:t xml:space="preserve">Bottom line. </w:t>
+      </w:r>
+      <w:r>
+        <w:t>Submit to Plant Direct now. If it declines the paper, move immediately to Royal Society Open Science and then PeerJ. Keep PhytoFrontiers ahead of PLOS ONE if specialist plant-pathology readership matters more than having a published timing metric.</w:t>
+      </w:r>
+    </w:p>
+    <w:p>
+      <w:r>
+        <w:rPr>
+          <w:b/>
+        </w:rPr>
+        <w:t xml:space="preserve">Optional four-day gamble. </w:t>
+      </w:r>
+      <w:r>
+        <w:t>If the BMC Genomics collection is still open and you are willing to accept a higher desk-rejection chance, you could try it before Plant Direct. A prompt desk rejection would cost little calendar time, but the 4-day median does not predict how long a manuscript sent for external review will take to reach acceptance.</w:t>
+      </w:r>
+    </w:p>
+    <w:p>
+      <w:pPr>
+        <w:pStyle w:val="Heading2"/>
         <w:keepNext/>
         <w:spacing w:before="180" w:after="60"/>
       </w:pPr>
       <w:r>
-        <w:rPr>
-          <w:rFonts w:ascii="Carlito" w:hAnsi="Carlito" w:eastAsia="Carlito"/>
-          <w:b/>
-          <w:color w:val="1F6D7A"/>
-          <w:sz w:val="26"/>
-        </w:rPr>
-        <w:t>1. Plant Direct</w:t>
-      </w:r>
-      <w:r>
-        <w:rPr>
-          <w:rFonts w:ascii="Carlito" w:hAnsi="Carlito" w:eastAsia="Carlito"/>
-          <w:b/>
-          <w:color w:val="1F6D7A"/>
-          <w:sz w:val="26"/>
-        </w:rPr>
-        <w:t xml:space="preserve"> - best overall fit</w:t>
+        <w:t>Plant Direct - best overall fit</w:t>
       </w:r>
     </w:p>
     <w:tbl>
@@ -730,22 +2750,7 @@
         <w:spacing w:before="180" w:after="60"/>
       </w:pPr>
       <w:r>
-        <w:rPr>
-          <w:rFonts w:ascii="Carlito" w:hAnsi="Carlito" w:eastAsia="Carlito"/>
-          <w:b/>
-          <w:color w:val="1F6D7A"/>
-          <w:sz w:val="26"/>
-        </w:rPr>
-        <w:t>2. BMC Genomics</w:t>
-      </w:r>
-      <w:r>
-        <w:rPr>
-          <w:rFonts w:ascii="Carlito" w:hAnsi="Carlito" w:eastAsia="Carlito"/>
-          <w:b/>
-          <w:color w:val="1F6D7A"/>
-          <w:sz w:val="26"/>
-        </w:rPr>
-        <w:t xml:space="preserve"> - "Genomics of plant pathogens" collection</w:t>
+        <w:t>BMC Genomics - "Genomics of plant pathogens" collection</w:t>
       </w:r>
     </w:p>
     <w:tbl>
@@ -1038,22 +3043,7 @@
         <w:spacing w:before="180" w:after="60"/>
       </w:pPr>
       <w:r>
-        <w:rPr>
-          <w:rFonts w:ascii="Carlito" w:hAnsi="Carlito" w:eastAsia="Carlito"/>
-          <w:b/>
-          <w:color w:val="1F6D7A"/>
-          <w:sz w:val="26"/>
-        </w:rPr>
-        <w:t>3. PhytoFrontiers</w:t>
-      </w:r>
-      <w:r>
-        <w:rPr>
-          <w:rFonts w:ascii="Carlito" w:hAnsi="Carlito" w:eastAsia="Carlito"/>
-          <w:b/>
-          <w:color w:val="1F6D7A"/>
-          <w:sz w:val="26"/>
-        </w:rPr>
-        <w:t xml:space="preserve"> - best specialist plant-pathology audience</w:t>
+        <w:t>PhytoFrontiers - best specialist plant-pathology audience</w:t>
       </w:r>
     </w:p>
     <w:tbl>
@@ -1324,13 +3314,7 @@
         <w:spacing w:before="180" w:after="60"/>
       </w:pPr>
       <w:r>
-        <w:rPr>
-          <w:rFonts w:ascii="Carlito" w:hAnsi="Carlito" w:eastAsia="Carlito"/>
-          <w:b/>
-          <w:color w:val="1F6D7A"/>
-          <w:sz w:val="26"/>
-        </w:rPr>
-        <w:t>4. BMC Plant Biology</w:t>
+        <w:t>BMC Plant Biology</w:t>
       </w:r>
     </w:p>
     <w:tbl>
@@ -1591,13 +3575,7 @@
         <w:spacing w:before="180" w:after="60"/>
       </w:pPr>
       <w:r>
-        <w:rPr>
-          <w:rFonts w:ascii="Carlito" w:hAnsi="Carlito" w:eastAsia="Carlito"/>
-          <w:b/>
-          <w:color w:val="1F6D7A"/>
-          <w:sz w:val="26"/>
-        </w:rPr>
-        <w:t>5. Royal Society Open Science</w:t>
+        <w:t>Royal Society Open Science</w:t>
       </w:r>
     </w:p>
     <w:tbl>
@@ -1830,13 +3808,7 @@
         <w:spacing w:before="180" w:after="60"/>
       </w:pPr>
       <w:r>
-        <w:rPr>
-          <w:rFonts w:ascii="Carlito" w:hAnsi="Carlito" w:eastAsia="Carlito"/>
-          <w:b/>
-          <w:color w:val="1F6D7A"/>
-          <w:sz w:val="26"/>
-        </w:rPr>
-        <w:t>6. PLOS ONE</w:t>
+        <w:t>PLOS ONE</w:t>
       </w:r>
     </w:p>
     <w:tbl>
@@ -2099,13 +4071,7 @@
         <w:spacing w:before="180" w:after="60"/>
       </w:pPr>
       <w:r>
-        <w:rPr>
-          <w:rFonts w:ascii="Carlito" w:hAnsi="Carlito" w:eastAsia="Carlito"/>
-          <w:b/>
-          <w:color w:val="1F6D7A"/>
-          <w:sz w:val="26"/>
-        </w:rPr>
-        <w:t>7. G3: Genes|Genomes|Genetics</w:t>
+        <w:t>G3: Genes|Genomes|Genetics</w:t>
       </w:r>
     </w:p>
     <w:tbl>
@@ -2338,13 +4304,7 @@
         <w:spacing w:before="180" w:after="60"/>
       </w:pPr>
       <w:r>
-        <w:rPr>
-          <w:rFonts w:ascii="Carlito" w:hAnsi="Carlito" w:eastAsia="Carlito"/>
-          <w:b/>
-          <w:color w:val="1F6D7A"/>
-          <w:sz w:val="26"/>
-        </w:rPr>
-        <w:t>8. PeerJ</w:t>
+        <w:t>PeerJ</w:t>
       </w:r>
     </w:p>
     <w:tbl>
@@ -2562,13 +4522,7 @@
         <w:spacing w:before="180" w:after="60"/>
       </w:pPr>
       <w:r>
-        <w:rPr>
-          <w:rFonts w:ascii="Carlito" w:hAnsi="Carlito" w:eastAsia="Carlito"/>
-          <w:b/>
-          <w:color w:val="1F6D7A"/>
-          <w:sz w:val="26"/>
-        </w:rPr>
-        <w:t>9. Scientific Reports</w:t>
+        <w:t>Scientific Reports</w:t>
       </w:r>
     </w:p>
     <w:tbl>
@@ -2844,22 +4798,7 @@
         <w:spacing w:before="180" w:after="60"/>
       </w:pPr>
       <w:r>
-        <w:rPr>
-          <w:rFonts w:ascii="Carlito" w:hAnsi="Carlito" w:eastAsia="Carlito"/>
-          <w:b/>
-          <w:color w:val="1F6D7A"/>
-          <w:sz w:val="26"/>
-        </w:rPr>
-        <w:t>10. Frontiers in Plant Science</w:t>
-      </w:r>
-      <w:r>
-        <w:rPr>
-          <w:rFonts w:ascii="Carlito" w:hAnsi="Carlito" w:eastAsia="Carlito"/>
-          <w:b/>
-          <w:color w:val="1F6D7A"/>
-          <w:sz w:val="26"/>
-        </w:rPr>
-        <w:t xml:space="preserve"> - Plant Bioinformatics section</w:t>
+        <w:t>Frontiers in Plant Science - Plant Bioinformatics section</w:t>
       </w:r>
     </w:p>
     <w:tbl>
@@ -3717,146 +5656,105 @@
       </w:r>
     </w:p>
     <w:p>
-      <w:pPr>
-        <w:keepNext w:val="0"/>
-        <w:spacing w:after="60" w:line="259" w:lineRule="auto"/>
-      </w:pPr>
+      <w:pPr/>
       <w:r>
-        <w:rPr>
-          <w:rFonts w:ascii="Carlito" w:hAnsi="Carlito" w:eastAsia="Carlito"/>
-          <w:color w:val="20252B"/>
-          <w:sz w:val="21"/>
-        </w:rPr>
-        <w:t>My preferred sequence would be:</w:t>
+        <w:t>For the fastest low-risk path, I would submit in this order:</w:t>
       </w:r>
     </w:p>
     <w:p>
       <w:pPr>
-        <w:spacing w:after="60" w:line="252" w:lineRule="auto"/>
-        <w:ind w:left="490" w:hanging="317"/>
+        <w:spacing w:after="20"/>
+        <w:ind w:left="288" w:hanging="288"/>
       </w:pPr>
       <w:r>
-        <w:rPr>
-          <w:rFonts w:ascii="Carlito" w:hAnsi="Carlito" w:eastAsia="Carlito"/>
-          <w:b/>
-          <w:color w:val="17365D"/>
-          <w:sz w:val="21"/>
-        </w:rPr>
-        <w:t xml:space="preserve">1.  </w:t>
-      </w:r>
-      <w:r>
-        <w:rPr>
-          <w:rFonts w:ascii="Carlito" w:hAnsi="Carlito" w:eastAsia="Carlito"/>
-          <w:color w:val="20252B"/>
-          <w:sz w:val="21"/>
-        </w:rPr>
-        <w:t>Plant Direct for the best overall balance of fit and acceptance realism.</w:t>
+        <w:t>1.  Plant Direct</w:t>
       </w:r>
     </w:p>
     <w:p>
       <w:pPr>
-        <w:spacing w:after="60" w:line="252" w:lineRule="auto"/>
-        <w:ind w:left="490" w:hanging="317"/>
+        <w:spacing w:after="20"/>
+        <w:ind w:left="288" w:hanging="288"/>
       </w:pPr>
       <w:r>
-        <w:rPr>
-          <w:rFonts w:ascii="Carlito" w:hAnsi="Carlito" w:eastAsia="Carlito"/>
-          <w:b/>
-          <w:color w:val="17365D"/>
-          <w:sz w:val="21"/>
-        </w:rPr>
-        <w:t xml:space="preserve">2.  </w:t>
-      </w:r>
-      <w:r>
-        <w:rPr>
-          <w:rFonts w:ascii="Carlito" w:hAnsi="Carlito" w:eastAsia="Carlito"/>
-          <w:color w:val="20252B"/>
-          <w:sz w:val="21"/>
-        </w:rPr>
-        <w:t>PhytoFrontiers if Plant Direct declines it.</w:t>
+        <w:t>2.  Royal Society Open Science</w:t>
       </w:r>
     </w:p>
     <w:p>
       <w:pPr>
-        <w:spacing w:after="60" w:line="252" w:lineRule="auto"/>
-        <w:ind w:left="490" w:hanging="317"/>
+        <w:spacing w:after="20"/>
+        <w:ind w:left="288" w:hanging="288"/>
       </w:pPr>
       <w:r>
-        <w:rPr>
-          <w:rFonts w:ascii="Carlito" w:hAnsi="Carlito" w:eastAsia="Carlito"/>
-          <w:b/>
-          <w:color w:val="17365D"/>
-          <w:sz w:val="21"/>
-        </w:rPr>
-        <w:t xml:space="preserve">3.  </w:t>
-      </w:r>
-      <w:r>
-        <w:rPr>
-          <w:rFonts w:ascii="Carlito" w:hAnsi="Carlito" w:eastAsia="Carlito"/>
-          <w:color w:val="20252B"/>
-          <w:sz w:val="21"/>
-        </w:rPr>
-        <w:t>BMC Plant Biology.</w:t>
+        <w:t>3.  PeerJ</w:t>
       </w:r>
     </w:p>
     <w:p>
       <w:pPr>
-        <w:spacing w:after="60" w:line="252" w:lineRule="auto"/>
-        <w:ind w:left="490" w:hanging="317"/>
+        <w:spacing w:after="20"/>
+        <w:ind w:left="288" w:hanging="288"/>
       </w:pPr>
       <w:r>
-        <w:rPr>
-          <w:rFonts w:ascii="Carlito" w:hAnsi="Carlito" w:eastAsia="Carlito"/>
-          <w:b/>
-          <w:color w:val="17365D"/>
-          <w:sz w:val="21"/>
-        </w:rPr>
-        <w:t xml:space="preserve">4.  </w:t>
-      </w:r>
-      <w:r>
-        <w:rPr>
-          <w:rFonts w:ascii="Carlito" w:hAnsi="Carlito" w:eastAsia="Carlito"/>
-          <w:color w:val="20252B"/>
-          <w:sz w:val="21"/>
-        </w:rPr>
-        <w:t>Royal Society Open Science or PLOS ONE.</w:t>
+        <w:t>4.  PhytoFrontiers</w:t>
       </w:r>
     </w:p>
     <w:p>
       <w:pPr>
-        <w:spacing w:after="60" w:line="252" w:lineRule="auto"/>
-        <w:ind w:left="490" w:hanging="317"/>
+        <w:spacing w:after="20"/>
+        <w:ind w:left="288" w:hanging="288"/>
       </w:pPr>
       <w:r>
-        <w:rPr>
-          <w:rFonts w:ascii="Carlito" w:hAnsi="Carlito" w:eastAsia="Carlito"/>
-          <w:b/>
-          <w:color w:val="17365D"/>
-          <w:sz w:val="21"/>
-        </w:rPr>
-        <w:t xml:space="preserve">5.  </w:t>
-      </w:r>
-      <w:r>
-        <w:rPr>
-          <w:rFonts w:ascii="Carlito" w:hAnsi="Carlito" w:eastAsia="Carlito"/>
-          <w:color w:val="20252B"/>
-          <w:sz w:val="21"/>
-        </w:rPr>
-        <w:t>PeerJ as another soundness-oriented fallback.</w:t>
+        <w:t>5.  PLOS ONE</w:t>
       </w:r>
     </w:p>
     <w:p>
       <w:pPr>
-        <w:keepNext w:val="0"/>
-        <w:spacing w:after="140" w:line="259" w:lineRule="auto"/>
+        <w:spacing w:after="20"/>
+        <w:ind w:left="288" w:hanging="288"/>
       </w:pPr>
       <w:r>
-        <w:rPr>
-          <w:rFonts w:ascii="Carlito" w:hAnsi="Carlito" w:eastAsia="Carlito"/>
-          <w:color w:val="20252B"/>
-          <w:sz w:val="21"/>
-        </w:rPr>
-        <w:t>A more ambitious sequence would place the BMC Genomics "Genomics of plant pathogens" collection first, followed by Plant Direct. Because that collection closes December 14, 2026 and explicitly solicits host transcriptomic responses, it is worth one attempt before moving to the safer options.</w:t>
+        <w:t>6.  BMC Genomics</w:t>
+      </w:r>
+    </w:p>
+    <w:p>
+      <w:pPr>
+        <w:spacing w:after="20"/>
+        <w:ind w:left="288" w:hanging="288"/>
+      </w:pPr>
+      <w:r>
+        <w:t>7.  BMC Plant Biology</w:t>
+      </w:r>
+    </w:p>
+    <w:p>
+      <w:pPr>
+        <w:spacing w:after="20"/>
+        <w:ind w:left="288" w:hanging="288"/>
+      </w:pPr>
+      <w:r>
+        <w:t>8.  G3: Genes|Genomes|Genetics</w:t>
+      </w:r>
+    </w:p>
+    <w:p>
+      <w:pPr>
+        <w:spacing w:after="20"/>
+        <w:ind w:left="288" w:hanging="288"/>
+      </w:pPr>
+      <w:r>
+        <w:t>9.  Scientific Reports</w:t>
+      </w:r>
+    </w:p>
+    <w:p>
+      <w:pPr>
+        <w:spacing w:after="20"/>
+        <w:ind w:left="288" w:hanging="288"/>
+      </w:pPr>
+      <w:r>
+        <w:t>10.  Frontiers in Plant Science</w:t>
+      </w:r>
+    </w:p>
+    <w:p>
+      <w:pPr/>
+      <w:r>
+        <w:t>Optional exception: because the BMC Genomics collection is time-limited and the journal reports a 4-day median first decision, one attempt there before Plant Direct is reasonable only if you are comfortable with its higher desk-rejection risk. Prepare the Plant Direct files in parallel so that a rejection causes no additional delay.</w:t>
       </w:r>
     </w:p>
     <w:p>
@@ -4202,21 +6100,7 @@
         <w:spacing w:after="100" w:line="259" w:lineRule="auto"/>
       </w:pPr>
       <w:r>
-        <w:rPr>
-          <w:rFonts w:ascii="Carlito" w:hAnsi="Carlito" w:eastAsia="Carlito"/>
-          <w:color w:val="20252B"/>
-          <w:sz w:val="21"/>
-        </w:rPr>
-        <w:t xml:space="preserve">Most of the strongest matches above are fully open-access journals and may charge article-processing fees. Because the manuscript reports no external funding, check waiver, discount, and institutional-agreement eligibility before choosing the final destination. </w:t>
-      </w:r>
-      <w:r>
-        <w:rPr>
-          <w:rFonts w:ascii="Carlito" w:hAnsi="Carlito" w:eastAsia="Carlito"/>
-          <w:i/>
-          <w:color w:val="5B6573"/>
-          <w:sz w:val="21"/>
-        </w:rPr>
-        <w:t>(Manuscript, Declarations, p. 22.)</w:t>
+        <w:t>Use the comparison table above as the current list-price baseline. Most of the strongest matches are fully open-access journals and charge only after acceptance. Because the manuscript reports no external funding, confirm NYU Langone institutional support and any waiver or society-discount eligibility before submission; waiver requests often must be made at submission. Do not commit personal funds until the publisher confirms the invoice amount.</w:t>
       </w:r>
     </w:p>
     <w:p>

</xml_diff>